<commit_message>
changes requested by Pathum
</commit_message>
<xml_diff>
--- a/deliverable-docs/AI Usage Report.docx
+++ b/deliverable-docs/AI Usage Report.docx
@@ -466,15 +466,7 @@
           </w:tcPr>
           <w:p>
             <w:r>
-              <w:t xml:space="preserve">Done analysis through </w:t>
-            </w:r>
-            <w:proofErr w:type="spellStart"/>
-            <w:r>
-              <w:t>Calude</w:t>
-            </w:r>
-            <w:proofErr w:type="spellEnd"/>
-            <w:r>
-              <w:t xml:space="preserve"> Code whether we are using Redpanda as event driven technology or not. Make sure all the database deployed in one cluster.</w:t>
+              <w:t>Done analysis through Calude Code whether we are using Redpanda as event driven technology or not. Make sure all the database deployed in one cluster.</w:t>
             </w:r>
           </w:p>
         </w:tc>
@@ -709,7 +701,7 @@
           </w:tcPr>
           <w:p>
             <w:r>
-              <w:t>[YOUR INPUT REQUIRED] — e.g., Updated service descriptions / corrected communication types for specific services.</w:t>
+              <w:t>Incorrect information not found during the generation.</w:t>
             </w:r>
           </w:p>
         </w:tc>
@@ -734,7 +726,7 @@
           </w:tcPr>
           <w:p>
             <w:r>
-              <w:t>[YOUR INPUT REQUIRED] — e.g., Verified all 8 services match the architecture PNG and Architecture Design Document content.</w:t>
+              <w:t>Check architecture diagram when validating the service table.</w:t>
             </w:r>
           </w:p>
         </w:tc>
@@ -759,7 +751,7 @@
           </w:tcPr>
           <w:p>
             <w:r>
-              <w:t>[YOUR INPUT REQUIRED]</w:t>
+              <w:t>No mistakes</w:t>
             </w:r>
           </w:p>
         </w:tc>
@@ -929,11 +921,11 @@
           </w:tcPr>
           <w:p>
             <w:r>
-              <w:t xml:space="preserve">Generated: src/index.js (Express app, CORS, /health endpoint), src/config/db.js (Mongoose connect), src/middleware/auth.js (JWT verify), src/models/Student.js (name, email, studentId, programme + timestamps), </w:t>
+              <w:t xml:space="preserve">Generated: src/index.js (Express app, CORS, /health endpoint), src/config/db.js (Mongoose connect), src/middleware/auth.js (JWT verify), src/models/Student.js (name, email, studentId, programme + timestamps), src/routes/students.js (POST /api/students, GET /api/students/:id, GET </w:t>
             </w:r>
             <w:r>
               <w:lastRenderedPageBreak/>
-              <w:t>src/routes/students.js (POST /api/students, GET /api/students/:id, GET /api/students), Dockerfile (node:20-alpine), package.json (express, mongoose, jsonwebtoken, cors, dotenv).</w:t>
+              <w:t>/api/students), Dockerfile (node:20-alpine), package.json (express, mongoose, jsonwebtoken, cors, dotenv).</w:t>
             </w:r>
           </w:p>
         </w:tc>

</xml_diff>

<commit_message>
AI Usage report changes
</commit_message>
<xml_diff>
--- a/deliverable-docs/AI Usage Report.docx
+++ b/deliverable-docs/AI Usage Report.docx
@@ -34,273 +34,14 @@
       </w:r>
     </w:p>
     <w:p>
-      <w:r>
-        <w:rPr>
-          <w:i/>
-        </w:rPr>
-        <w:t>AI tool used throughout: Claude (claude-sonnet-4-6) via Claude Code CLI (Anthropic).</w:t>
-      </w:r>
-    </w:p>
-    <w:p>
       <w:pPr>
         <w:pStyle w:val="Heading1"/>
       </w:pPr>
       <w:r>
-        <w:t>2. How to Read This Report</w:t>
+        <w:t>2</w:t>
       </w:r>
-    </w:p>
-    <w:p>
       <w:r>
-        <w:t>Each entry corresponds to one distinct AI-assisted task. Fields marked [YOUR INPUT REQUIRED] must be completed by you before submission — these capture your personal validation, corrections, and reflection, which is what the examiner is evaluating.</w:t>
-      </w:r>
-    </w:p>
-    <w:tbl>
-      <w:tblPr>
-        <w:tblStyle w:val="TableGrid"/>
-        <w:tblW w:w="0" w:type="auto"/>
-        <w:tblLook w:val="04A0" w:firstRow="1" w:lastRow="0" w:firstColumn="1" w:lastColumn="0" w:noHBand="0" w:noVBand="1"/>
-      </w:tblPr>
-      <w:tblGrid>
-        <w:gridCol w:w="4320"/>
-        <w:gridCol w:w="4320"/>
-      </w:tblGrid>
-      <w:tr>
-        <w:tc>
-          <w:tcPr>
-            <w:tcW w:w="4320" w:type="dxa"/>
-          </w:tcPr>
-          <w:p>
-            <w:r>
-              <w:rPr>
-                <w:b/>
-              </w:rPr>
-              <w:t>Field</w:t>
-            </w:r>
-          </w:p>
-        </w:tc>
-        <w:tc>
-          <w:tcPr>
-            <w:tcW w:w="4320" w:type="dxa"/>
-          </w:tcPr>
-          <w:p>
-            <w:r>
-              <w:rPr>
-                <w:b/>
-              </w:rPr>
-              <w:t>Meaning</w:t>
-            </w:r>
-          </w:p>
-        </w:tc>
-      </w:tr>
-      <w:tr>
-        <w:tc>
-          <w:tcPr>
-            <w:tcW w:w="4320" w:type="dxa"/>
-          </w:tcPr>
-          <w:p>
-            <w:r>
-              <w:t>Tool used</w:t>
-            </w:r>
-          </w:p>
-        </w:tc>
-        <w:tc>
-          <w:tcPr>
-            <w:tcW w:w="4320" w:type="dxa"/>
-          </w:tcPr>
-          <w:p>
-            <w:r>
-              <w:t>The AI tool and model invoked</w:t>
-            </w:r>
-          </w:p>
-        </w:tc>
-      </w:tr>
-      <w:tr>
-        <w:tc>
-          <w:tcPr>
-            <w:tcW w:w="4320" w:type="dxa"/>
-          </w:tcPr>
-          <w:p>
-            <w:r>
-              <w:t>Task / purpose</w:t>
-            </w:r>
-          </w:p>
-        </w:tc>
-        <w:tc>
-          <w:tcPr>
-            <w:tcW w:w="4320" w:type="dxa"/>
-          </w:tcPr>
-          <w:p>
-            <w:r>
-              <w:t>What you asked the AI to do and why</w:t>
-            </w:r>
-          </w:p>
-        </w:tc>
-      </w:tr>
-      <w:tr>
-        <w:tc>
-          <w:tcPr>
-            <w:tcW w:w="4320" w:type="dxa"/>
-          </w:tcPr>
-          <w:p>
-            <w:r>
-              <w:t>Prompt used</w:t>
-            </w:r>
-          </w:p>
-        </w:tc>
-        <w:tc>
-          <w:tcPr>
-            <w:tcW w:w="4320" w:type="dxa"/>
-          </w:tcPr>
-          <w:p>
-            <w:r>
-              <w:t>The exact prompt or instruction given</w:t>
-            </w:r>
-          </w:p>
-        </w:tc>
-      </w:tr>
-      <w:tr>
-        <w:tc>
-          <w:tcPr>
-            <w:tcW w:w="4320" w:type="dxa"/>
-          </w:tcPr>
-          <w:p>
-            <w:r>
-              <w:t>AI output (summary)</w:t>
-            </w:r>
-          </w:p>
-        </w:tc>
-        <w:tc>
-          <w:tcPr>
-            <w:tcW w:w="4320" w:type="dxa"/>
-          </w:tcPr>
-          <w:p>
-            <w:r>
-              <w:t>What the AI produced — summarised or quoted</w:t>
-            </w:r>
-          </w:p>
-        </w:tc>
-      </w:tr>
-      <w:tr>
-        <w:tc>
-          <w:tcPr>
-            <w:tcW w:w="4320" w:type="dxa"/>
-          </w:tcPr>
-          <w:p>
-            <w:r>
-              <w:t>Human corrections</w:t>
-            </w:r>
-          </w:p>
-        </w:tc>
-        <w:tc>
-          <w:tcPr>
-            <w:tcW w:w="4320" w:type="dxa"/>
-          </w:tcPr>
-          <w:p>
-            <w:r>
-              <w:t>What you changed, added, or removed from the AI output</w:t>
-            </w:r>
-          </w:p>
-        </w:tc>
-      </w:tr>
-      <w:tr>
-        <w:tc>
-          <w:tcPr>
-            <w:tcW w:w="4320" w:type="dxa"/>
-          </w:tcPr>
-          <w:p>
-            <w:r>
-              <w:t>Validation method</w:t>
-            </w:r>
-          </w:p>
-        </w:tc>
-        <w:tc>
-          <w:tcPr>
-            <w:tcW w:w="4320" w:type="dxa"/>
-          </w:tcPr>
-          <w:p>
-            <w:r>
-              <w:t>How you checked the output was correct</w:t>
-            </w:r>
-          </w:p>
-        </w:tc>
-      </w:tr>
-      <w:tr>
-        <w:tc>
-          <w:tcPr>
-            <w:tcW w:w="4320" w:type="dxa"/>
-          </w:tcPr>
-          <w:p>
-            <w:r>
-              <w:t>Mistakes / hallucinations</w:t>
-            </w:r>
-          </w:p>
-        </w:tc>
-        <w:tc>
-          <w:tcPr>
-            <w:tcW w:w="4320" w:type="dxa"/>
-          </w:tcPr>
-          <w:p>
-            <w:r>
-              <w:t>Any errors the AI made that you caught</w:t>
-            </w:r>
-          </w:p>
-        </w:tc>
-      </w:tr>
-      <w:tr>
-        <w:tc>
-          <w:tcPr>
-            <w:tcW w:w="4320" w:type="dxa"/>
-          </w:tcPr>
-          <w:p>
-            <w:r>
-              <w:t>Ethical / privacy concerns</w:t>
-            </w:r>
-          </w:p>
-        </w:tc>
-        <w:tc>
-          <w:tcPr>
-            <w:tcW w:w="4320" w:type="dxa"/>
-          </w:tcPr>
-          <w:p>
-            <w:r>
-              <w:t>Whether any prompt contained sensitive data</w:t>
-            </w:r>
-          </w:p>
-        </w:tc>
-      </w:tr>
-      <w:tr>
-        <w:tc>
-          <w:tcPr>
-            <w:tcW w:w="4320" w:type="dxa"/>
-          </w:tcPr>
-          <w:p>
-            <w:r>
-              <w:t>Reflection</w:t>
-            </w:r>
-          </w:p>
-        </w:tc>
-        <w:tc>
-          <w:tcPr>
-            <w:tcW w:w="4320" w:type="dxa"/>
-          </w:tcPr>
-          <w:p>
-            <w:r>
-              <w:t>Your assessment of whether the AI helped and was trustworthy</w:t>
-            </w:r>
-          </w:p>
-        </w:tc>
-      </w:tr>
-    </w:tbl>
-    <w:p/>
-    <w:p/>
-    <w:p/>
-    <w:p>
-      <w:pPr>
-        <w:pStyle w:val="Heading1"/>
-      </w:pPr>
-      <w:r>
-        <w:lastRenderedPageBreak/>
-        <w:t>3. AI Usage Log</w:t>
+        <w:t>. AI Usage Log</w:t>
       </w:r>
     </w:p>
     <w:p>
@@ -456,6 +197,7 @@
               <w:rPr>
                 <w:b/>
               </w:rPr>
+              <w:lastRenderedPageBreak/>
               <w:t>Validation method</w:t>
             </w:r>
           </w:p>
@@ -550,13 +292,6 @@
         </w:tc>
       </w:tr>
     </w:tbl>
-    <w:p/>
-    <w:p/>
-    <w:p>
-      <w:pPr>
-        <w:pStyle w:val="Heading2"/>
-      </w:pPr>
-    </w:p>
     <w:p>
       <w:pPr>
         <w:pStyle w:val="Heading2"/>
@@ -578,13 +313,13 @@
         <w:tblLook w:val="04A0" w:firstRow="1" w:lastRow="0" w:firstColumn="1" w:lastColumn="0" w:noHBand="0" w:noVBand="1"/>
       </w:tblPr>
       <w:tblGrid>
-        <w:gridCol w:w="4320"/>
-        <w:gridCol w:w="4320"/>
+        <w:gridCol w:w="3227"/>
+        <w:gridCol w:w="5413"/>
       </w:tblGrid>
       <w:tr>
         <w:tc>
           <w:tcPr>
-            <w:tcW w:w="4320" w:type="dxa"/>
+            <w:tcW w:w="3227" w:type="dxa"/>
           </w:tcPr>
           <w:p>
             <w:r>
@@ -597,7 +332,7 @@
         </w:tc>
         <w:tc>
           <w:tcPr>
-            <w:tcW w:w="4320" w:type="dxa"/>
+            <w:tcW w:w="5413" w:type="dxa"/>
           </w:tcPr>
           <w:p>
             <w:r>
@@ -609,7 +344,7 @@
       <w:tr>
         <w:tc>
           <w:tcPr>
-            <w:tcW w:w="4320" w:type="dxa"/>
+            <w:tcW w:w="3227" w:type="dxa"/>
           </w:tcPr>
           <w:p>
             <w:r>
@@ -622,7 +357,7 @@
         </w:tc>
         <w:tc>
           <w:tcPr>
-            <w:tcW w:w="4320" w:type="dxa"/>
+            <w:tcW w:w="5413" w:type="dxa"/>
           </w:tcPr>
           <w:p>
             <w:r>
@@ -634,7 +369,7 @@
       <w:tr>
         <w:tc>
           <w:tcPr>
-            <w:tcW w:w="4320" w:type="dxa"/>
+            <w:tcW w:w="3227" w:type="dxa"/>
           </w:tcPr>
           <w:p>
             <w:r>
@@ -647,7 +382,7 @@
         </w:tc>
         <w:tc>
           <w:tcPr>
-            <w:tcW w:w="4320" w:type="dxa"/>
+            <w:tcW w:w="5413" w:type="dxa"/>
           </w:tcPr>
           <w:p>
             <w:r>
@@ -659,7 +394,7 @@
       <w:tr>
         <w:tc>
           <w:tcPr>
-            <w:tcW w:w="4320" w:type="dxa"/>
+            <w:tcW w:w="3227" w:type="dxa"/>
           </w:tcPr>
           <w:p>
             <w:r>
@@ -672,7 +407,7 @@
         </w:tc>
         <w:tc>
           <w:tcPr>
-            <w:tcW w:w="4320" w:type="dxa"/>
+            <w:tcW w:w="5413" w:type="dxa"/>
           </w:tcPr>
           <w:p>
             <w:r>
@@ -684,7 +419,7 @@
       <w:tr>
         <w:tc>
           <w:tcPr>
-            <w:tcW w:w="4320" w:type="dxa"/>
+            <w:tcW w:w="3227" w:type="dxa"/>
           </w:tcPr>
           <w:p>
             <w:r>
@@ -697,7 +432,7 @@
         </w:tc>
         <w:tc>
           <w:tcPr>
-            <w:tcW w:w="4320" w:type="dxa"/>
+            <w:tcW w:w="5413" w:type="dxa"/>
           </w:tcPr>
           <w:p>
             <w:r>
@@ -709,7 +444,7 @@
       <w:tr>
         <w:tc>
           <w:tcPr>
-            <w:tcW w:w="4320" w:type="dxa"/>
+            <w:tcW w:w="3227" w:type="dxa"/>
           </w:tcPr>
           <w:p>
             <w:r>
@@ -722,7 +457,7 @@
         </w:tc>
         <w:tc>
           <w:tcPr>
-            <w:tcW w:w="4320" w:type="dxa"/>
+            <w:tcW w:w="5413" w:type="dxa"/>
           </w:tcPr>
           <w:p>
             <w:r>
@@ -734,7 +469,7 @@
       <w:tr>
         <w:tc>
           <w:tcPr>
-            <w:tcW w:w="4320" w:type="dxa"/>
+            <w:tcW w:w="3227" w:type="dxa"/>
           </w:tcPr>
           <w:p>
             <w:r>
@@ -747,7 +482,7 @@
         </w:tc>
         <w:tc>
           <w:tcPr>
-            <w:tcW w:w="4320" w:type="dxa"/>
+            <w:tcW w:w="5413" w:type="dxa"/>
           </w:tcPr>
           <w:p>
             <w:r>
@@ -759,7 +494,7 @@
       <w:tr>
         <w:tc>
           <w:tcPr>
-            <w:tcW w:w="4320" w:type="dxa"/>
+            <w:tcW w:w="3227" w:type="dxa"/>
           </w:tcPr>
           <w:p>
             <w:r>
@@ -772,7 +507,7 @@
         </w:tc>
         <w:tc>
           <w:tcPr>
-            <w:tcW w:w="4320" w:type="dxa"/>
+            <w:tcW w:w="5413" w:type="dxa"/>
           </w:tcPr>
           <w:p>
             <w:r>
@@ -784,7 +519,7 @@
       <w:tr>
         <w:tc>
           <w:tcPr>
-            <w:tcW w:w="4320" w:type="dxa"/>
+            <w:tcW w:w="3227" w:type="dxa"/>
           </w:tcPr>
           <w:p>
             <w:r>
@@ -797,17 +532,16 @@
         </w:tc>
         <w:tc>
           <w:tcPr>
-            <w:tcW w:w="4320" w:type="dxa"/>
+            <w:tcW w:w="5413" w:type="dxa"/>
           </w:tcPr>
           <w:p>
             <w:r>
-              <w:t>[YOUR INPUT REQUIRED]</w:t>
+              <w:t>According to the architecture diagram and the development, properly created.</w:t>
             </w:r>
           </w:p>
         </w:tc>
       </w:tr>
     </w:tbl>
-    <w:p/>
     <w:p>
       <w:pPr>
         <w:pStyle w:val="Heading2"/>
@@ -823,13 +557,13 @@
         <w:tblLook w:val="04A0" w:firstRow="1" w:lastRow="0" w:firstColumn="1" w:lastColumn="0" w:noHBand="0" w:noVBand="1"/>
       </w:tblPr>
       <w:tblGrid>
-        <w:gridCol w:w="4320"/>
-        <w:gridCol w:w="4320"/>
+        <w:gridCol w:w="3227"/>
+        <w:gridCol w:w="5413"/>
       </w:tblGrid>
       <w:tr>
         <w:tc>
           <w:tcPr>
-            <w:tcW w:w="4320" w:type="dxa"/>
+            <w:tcW w:w="3227" w:type="dxa"/>
           </w:tcPr>
           <w:p>
             <w:r>
@@ -842,7 +576,7 @@
         </w:tc>
         <w:tc>
           <w:tcPr>
-            <w:tcW w:w="4320" w:type="dxa"/>
+            <w:tcW w:w="5413" w:type="dxa"/>
           </w:tcPr>
           <w:p>
             <w:r>
@@ -854,7 +588,7 @@
       <w:tr>
         <w:tc>
           <w:tcPr>
-            <w:tcW w:w="4320" w:type="dxa"/>
+            <w:tcW w:w="3227" w:type="dxa"/>
           </w:tcPr>
           <w:p>
             <w:r>
@@ -867,11 +601,27 @@
         </w:tc>
         <w:tc>
           <w:tcPr>
-            <w:tcW w:w="4320" w:type="dxa"/>
+            <w:tcW w:w="5413" w:type="dxa"/>
           </w:tcPr>
           <w:p>
             <w:r>
-              <w:t>Scaffold a complete Node.js/Express Student Service (port 3001) with Mongoose model, JWT middleware, REST routes, Dockerfile, and package.json.</w:t>
+              <w:t xml:space="preserve">Scaffold a complete Node.js/Express Student Service (port 3001) with Mongoose model, JWT middleware, REST routes, </w:t>
+            </w:r>
+            <w:proofErr w:type="spellStart"/>
+            <w:r>
+              <w:t>Dockerfile</w:t>
+            </w:r>
+            <w:proofErr w:type="spellEnd"/>
+            <w:r>
+              <w:t xml:space="preserve">, and </w:t>
+            </w:r>
+            <w:proofErr w:type="spellStart"/>
+            <w:r>
+              <w:t>package.json</w:t>
+            </w:r>
+            <w:proofErr w:type="spellEnd"/>
+            <w:r>
+              <w:t>.</w:t>
             </w:r>
           </w:p>
         </w:tc>
@@ -879,7 +629,7 @@
       <w:tr>
         <w:tc>
           <w:tcPr>
-            <w:tcW w:w="4320" w:type="dxa"/>
+            <w:tcW w:w="3227" w:type="dxa"/>
           </w:tcPr>
           <w:p>
             <w:r>
@@ -892,7 +642,7 @@
         </w:tc>
         <w:tc>
           <w:tcPr>
-            <w:tcW w:w="4320" w:type="dxa"/>
+            <w:tcW w:w="5413" w:type="dxa"/>
           </w:tcPr>
           <w:p>
             <w:r>
@@ -904,7 +654,7 @@
       <w:tr>
         <w:tc>
           <w:tcPr>
-            <w:tcW w:w="4320" w:type="dxa"/>
+            <w:tcW w:w="3227" w:type="dxa"/>
           </w:tcPr>
           <w:p>
             <w:r>
@@ -917,7 +667,7 @@
         </w:tc>
         <w:tc>
           <w:tcPr>
-            <w:tcW w:w="4320" w:type="dxa"/>
+            <w:tcW w:w="5413" w:type="dxa"/>
           </w:tcPr>
           <w:p>
             <w:r>
@@ -933,7 +683,7 @@
       <w:tr>
         <w:tc>
           <w:tcPr>
-            <w:tcW w:w="4320" w:type="dxa"/>
+            <w:tcW w:w="3227" w:type="dxa"/>
           </w:tcPr>
           <w:p>
             <w:r>
@@ -947,11 +697,11 @@
         </w:tc>
         <w:tc>
           <w:tcPr>
-            <w:tcW w:w="4320" w:type="dxa"/>
+            <w:tcW w:w="5413" w:type="dxa"/>
           </w:tcPr>
           <w:p>
             <w:r>
-              <w:t>[YOUR INPUT REQUIRED] — e.g., Added input validation / changed field names.</w:t>
+              <w:t>According to the requirement student service was implemented.</w:t>
             </w:r>
           </w:p>
         </w:tc>
@@ -959,7 +709,7 @@
       <w:tr>
         <w:tc>
           <w:tcPr>
-            <w:tcW w:w="4320" w:type="dxa"/>
+            <w:tcW w:w="3227" w:type="dxa"/>
           </w:tcPr>
           <w:p>
             <w:r>
@@ -972,11 +722,11 @@
         </w:tc>
         <w:tc>
           <w:tcPr>
-            <w:tcW w:w="4320" w:type="dxa"/>
+            <w:tcW w:w="5413" w:type="dxa"/>
           </w:tcPr>
           <w:p>
             <w:r>
-              <w:t>[YOUR INPUT REQUIRED] — e.g., Ran service locally with npm start and tested endpoints with Postman / curl.</w:t>
+              <w:t>Ran locally through Docker compose.</w:t>
             </w:r>
           </w:p>
         </w:tc>
@@ -984,7 +734,7 @@
       <w:tr>
         <w:tc>
           <w:tcPr>
-            <w:tcW w:w="4320" w:type="dxa"/>
+            <w:tcW w:w="3227" w:type="dxa"/>
           </w:tcPr>
           <w:p>
             <w:r>
@@ -997,11 +747,11 @@
         </w:tc>
         <w:tc>
           <w:tcPr>
-            <w:tcW w:w="4320" w:type="dxa"/>
+            <w:tcW w:w="5413" w:type="dxa"/>
           </w:tcPr>
           <w:p>
             <w:r>
-              <w:t>[YOUR INPUT REQUIRED] — e.g., Initial paragraph style bug in read_docx tool was caught (para.style was None) and corrected.</w:t>
+              <w:t>No mistakes</w:t>
             </w:r>
           </w:p>
         </w:tc>
@@ -1009,7 +759,7 @@
       <w:tr>
         <w:tc>
           <w:tcPr>
-            <w:tcW w:w="4320" w:type="dxa"/>
+            <w:tcW w:w="3227" w:type="dxa"/>
           </w:tcPr>
           <w:p>
             <w:r>
@@ -1022,7 +772,7 @@
         </w:tc>
         <w:tc>
           <w:tcPr>
-            <w:tcW w:w="4320" w:type="dxa"/>
+            <w:tcW w:w="5413" w:type="dxa"/>
           </w:tcPr>
           <w:p>
             <w:r>
@@ -1034,7 +784,7 @@
       <w:tr>
         <w:tc>
           <w:tcPr>
-            <w:tcW w:w="4320" w:type="dxa"/>
+            <w:tcW w:w="3227" w:type="dxa"/>
           </w:tcPr>
           <w:p>
             <w:r>
@@ -1047,11 +797,23 @@
         </w:tc>
         <w:tc>
           <w:tcPr>
-            <w:tcW w:w="4320" w:type="dxa"/>
+            <w:tcW w:w="5413" w:type="dxa"/>
           </w:tcPr>
           <w:p>
             <w:r>
-              <w:t>[YOUR INPUT REQUIRED]</w:t>
+              <w:t>According to the architecture diagra</w:t>
+            </w:r>
+            <w:r>
+              <w:t>m and use-case that defined in the requirement and existing system</w:t>
+            </w:r>
+            <w:r>
+              <w:t xml:space="preserve">, properly </w:t>
+            </w:r>
+            <w:r>
+              <w:t>implemented</w:t>
+            </w:r>
+            <w:r>
+              <w:t>.</w:t>
             </w:r>
           </w:p>
         </w:tc>
@@ -1196,7 +958,13 @@
           </w:tcPr>
           <w:p>
             <w:r>
-              <w:t>[YOUR INPUT REQUIRED]</w:t>
+              <w:t xml:space="preserve">According to the requirement </w:t>
+            </w:r>
+            <w:r>
+              <w:t>exam</w:t>
+            </w:r>
+            <w:r>
+              <w:t xml:space="preserve"> service was implemented.</w:t>
             </w:r>
           </w:p>
         </w:tc>
@@ -1221,7 +989,13 @@
           </w:tcPr>
           <w:p>
             <w:r>
-              <w:t>[YOUR INPUT REQUIRED] — e.g., Ran docker-compose up --build and tested the cross-service flow: created a student, then enrolled them in an exam, then attempted enrolment with an invalid studentId to verify 404 response.</w:t>
+              <w:t xml:space="preserve">Ran docker-compose up --build and tested the cross-service flow: created a student, then enrolled them in an exam, then attempted enrolment with an invalid studentId to verify 404 </w:t>
+            </w:r>
+            <w:r>
+              <w:t>responses</w:t>
+            </w:r>
+            <w:r>
+              <w:t>.</w:t>
             </w:r>
           </w:p>
         </w:tc>
@@ -1246,7 +1020,7 @@
           </w:tcPr>
           <w:p>
             <w:r>
-              <w:t>[YOUR INPUT REQUIRED]</w:t>
+              <w:t>No Mistakes</w:t>
             </w:r>
           </w:p>
         </w:tc>
@@ -1296,1526 +1070,13 @@
           </w:tcPr>
           <w:p>
             <w:r>
-              <w:t>[YOUR INPUT REQUIRED]</w:t>
+              <w:t>According to the architecture diagram and use-case that defined in the requirement and existing system, properly implemented.</w:t>
             </w:r>
           </w:p>
         </w:tc>
       </w:tr>
     </w:tbl>
     <w:p/>
-    <w:p>
-      <w:pPr>
-        <w:pStyle w:val="Heading2"/>
-      </w:pPr>
-      <w:r>
-        <w:lastRenderedPageBreak/>
-        <w:t>Entry 6 — Generate Benefits &amp; Risks</w:t>
-      </w:r>
-    </w:p>
-    <w:tbl>
-      <w:tblPr>
-        <w:tblStyle w:val="TableGrid"/>
-        <w:tblW w:w="0" w:type="auto"/>
-        <w:tblLook w:val="04A0" w:firstRow="1" w:lastRow="0" w:firstColumn="1" w:lastColumn="0" w:noHBand="0" w:noVBand="1"/>
-      </w:tblPr>
-      <w:tblGrid>
-        <w:gridCol w:w="4320"/>
-        <w:gridCol w:w="4320"/>
-      </w:tblGrid>
-      <w:tr>
-        <w:tc>
-          <w:tcPr>
-            <w:tcW w:w="4320" w:type="dxa"/>
-          </w:tcPr>
-          <w:p>
-            <w:r>
-              <w:rPr>
-                <w:b/>
-              </w:rPr>
-              <w:t>Tool used</w:t>
-            </w:r>
-          </w:p>
-        </w:tc>
-        <w:tc>
-          <w:tcPr>
-            <w:tcW w:w="4320" w:type="dxa"/>
-          </w:tcPr>
-          <w:p>
-            <w:r>
-              <w:t>Claude claude-sonnet-4-6 via Claude Code CLI</w:t>
-            </w:r>
-          </w:p>
-        </w:tc>
-      </w:tr>
-      <w:tr>
-        <w:tc>
-          <w:tcPr>
-            <w:tcW w:w="4320" w:type="dxa"/>
-          </w:tcPr>
-          <w:p>
-            <w:r>
-              <w:rPr>
-                <w:b/>
-              </w:rPr>
-              <w:t>Task / purpose</w:t>
-            </w:r>
-          </w:p>
-        </w:tc>
-        <w:tc>
-          <w:tcPr>
-            <w:tcW w:w="4320" w:type="dxa"/>
-          </w:tcPr>
-          <w:p>
-            <w:r>
-              <w:t>Generate Benefits and Risks_Benefits_and_Risks.docx with a thorough analysis of the benefits and risks of microservice architecture for this university ERP system, each risk with an explicit mitigation.</w:t>
-            </w:r>
-          </w:p>
-        </w:tc>
-      </w:tr>
-      <w:tr>
-        <w:tc>
-          <w:tcPr>
-            <w:tcW w:w="4320" w:type="dxa"/>
-          </w:tcPr>
-          <w:p>
-            <w:r>
-              <w:rPr>
-                <w:b/>
-              </w:rPr>
-              <w:t>Prompt used</w:t>
-            </w:r>
-          </w:p>
-        </w:tc>
-        <w:tc>
-          <w:tcPr>
-            <w:tcW w:w="4320" w:type="dxa"/>
-          </w:tcPr>
-          <w:p>
-            <w:r>
-              <w:t>"continue" (following the confirmed delivery plan)</w:t>
-            </w:r>
-          </w:p>
-        </w:tc>
-      </w:tr>
-      <w:tr>
-        <w:tc>
-          <w:tcPr>
-            <w:tcW w:w="4320" w:type="dxa"/>
-          </w:tcPr>
-          <w:p>
-            <w:r>
-              <w:rPr>
-                <w:b/>
-              </w:rPr>
-              <w:t>AI output (summary)</w:t>
-            </w:r>
-          </w:p>
-        </w:tc>
-        <w:tc>
-          <w:tcPr>
-            <w:tcW w:w="4320" w:type="dxa"/>
-          </w:tcPr>
-          <w:p>
-            <w:r>
-              <w:t>Generated 7 benefits (independent deployability, fault isolation, scalability, technology flexibility, focused codebases, async decoupling, team autonomy) and 6 risks with mitigations (distributed complexity, data consistency, infrastructure overhead, inter-service latency, debugging difficulty, security surface area). Includes a 10-row summary table with net verdict per dimension.</w:t>
-            </w:r>
-          </w:p>
-        </w:tc>
-      </w:tr>
-      <w:tr>
-        <w:tc>
-          <w:tcPr>
-            <w:tcW w:w="4320" w:type="dxa"/>
-          </w:tcPr>
-          <w:p>
-            <w:r>
-              <w:rPr>
-                <w:b/>
-              </w:rPr>
-              <w:t>Human corrections</w:t>
-            </w:r>
-          </w:p>
-        </w:tc>
-        <w:tc>
-          <w:tcPr>
-            <w:tcW w:w="4320" w:type="dxa"/>
-          </w:tcPr>
-          <w:p>
-            <w:r>
-              <w:t>[YOUR INPUT REQUIRED]</w:t>
-            </w:r>
-          </w:p>
-        </w:tc>
-      </w:tr>
-      <w:tr>
-        <w:tc>
-          <w:tcPr>
-            <w:tcW w:w="4320" w:type="dxa"/>
-          </w:tcPr>
-          <w:p>
-            <w:r>
-              <w:rPr>
-                <w:b/>
-              </w:rPr>
-              <w:t>Validation method</w:t>
-            </w:r>
-          </w:p>
-        </w:tc>
-        <w:tc>
-          <w:tcPr>
-            <w:tcW w:w="4320" w:type="dxa"/>
-          </w:tcPr>
-          <w:p>
-            <w:r>
-              <w:t>[YOUR INPUT REQUIRED] — e.g., Reviewed against lecture notes on microservice trade-offs and cross-checked mitigations against the actual design decisions in Architecture Design Document.</w:t>
-            </w:r>
-          </w:p>
-        </w:tc>
-      </w:tr>
-      <w:tr>
-        <w:tc>
-          <w:tcPr>
-            <w:tcW w:w="4320" w:type="dxa"/>
-          </w:tcPr>
-          <w:p>
-            <w:r>
-              <w:rPr>
-                <w:b/>
-              </w:rPr>
-              <w:t>Mistakes / hallucinations</w:t>
-            </w:r>
-          </w:p>
-        </w:tc>
-        <w:tc>
-          <w:tcPr>
-            <w:tcW w:w="4320" w:type="dxa"/>
-          </w:tcPr>
-          <w:p>
-            <w:r>
-              <w:t>[YOUR INPUT REQUIRED]</w:t>
-            </w:r>
-          </w:p>
-        </w:tc>
-      </w:tr>
-      <w:tr>
-        <w:tc>
-          <w:tcPr>
-            <w:tcW w:w="4320" w:type="dxa"/>
-          </w:tcPr>
-          <w:p>
-            <w:r>
-              <w:rPr>
-                <w:b/>
-              </w:rPr>
-              <w:t>Ethical / privacy concerns</w:t>
-            </w:r>
-          </w:p>
-        </w:tc>
-        <w:tc>
-          <w:tcPr>
-            <w:tcW w:w="4320" w:type="dxa"/>
-          </w:tcPr>
-          <w:p>
-            <w:r>
-              <w:t>No sensitive data.</w:t>
-            </w:r>
-          </w:p>
-        </w:tc>
-      </w:tr>
-      <w:tr>
-        <w:tc>
-          <w:tcPr>
-            <w:tcW w:w="4320" w:type="dxa"/>
-          </w:tcPr>
-          <w:p>
-            <w:r>
-              <w:rPr>
-                <w:b/>
-              </w:rPr>
-              <w:t>Reflection</w:t>
-            </w:r>
-          </w:p>
-        </w:tc>
-        <w:tc>
-          <w:tcPr>
-            <w:tcW w:w="4320" w:type="dxa"/>
-          </w:tcPr>
-          <w:p>
-            <w:r>
-              <w:t>[YOUR INPUT REQUIRED]</w:t>
-            </w:r>
-          </w:p>
-        </w:tc>
-      </w:tr>
-    </w:tbl>
-    <w:p/>
-    <w:p>
-      <w:pPr>
-        <w:pStyle w:val="Heading2"/>
-      </w:pPr>
-      <w:r>
-        <w:t>Entry 7 — Generate Architecture Design Document (incl. Database Strategy)</w:t>
-      </w:r>
-    </w:p>
-    <w:tbl>
-      <w:tblPr>
-        <w:tblStyle w:val="TableGrid"/>
-        <w:tblW w:w="0" w:type="auto"/>
-        <w:tblLook w:val="04A0" w:firstRow="1" w:lastRow="0" w:firstColumn="1" w:lastColumn="0" w:noHBand="0" w:noVBand="1"/>
-      </w:tblPr>
-      <w:tblGrid>
-        <w:gridCol w:w="4150"/>
-        <w:gridCol w:w="4706"/>
-      </w:tblGrid>
-      <w:tr>
-        <w:tc>
-          <w:tcPr>
-            <w:tcW w:w="4320" w:type="dxa"/>
-          </w:tcPr>
-          <w:p>
-            <w:r>
-              <w:rPr>
-                <w:b/>
-              </w:rPr>
-              <w:t>Tool used</w:t>
-            </w:r>
-          </w:p>
-        </w:tc>
-        <w:tc>
-          <w:tcPr>
-            <w:tcW w:w="4320" w:type="dxa"/>
-          </w:tcPr>
-          <w:p>
-            <w:r>
-              <w:t>Claude claude-sonnet-4-6 via Claude Code CLI</w:t>
-            </w:r>
-          </w:p>
-        </w:tc>
-      </w:tr>
-      <w:tr>
-        <w:tc>
-          <w:tcPr>
-            <w:tcW w:w="4320" w:type="dxa"/>
-          </w:tcPr>
-          <w:p>
-            <w:r>
-              <w:rPr>
-                <w:b/>
-              </w:rPr>
-              <w:t>Task / purpose</w:t>
-            </w:r>
-          </w:p>
-        </w:tc>
-        <w:tc>
-          <w:tcPr>
-            <w:tcW w:w="4320" w:type="dxa"/>
-          </w:tcPr>
-          <w:p>
-            <w:r>
-              <w:t>Generate Architecture Design Document_Architecture_Design_Document.docx — the main architecture document with all 8 services, technology decisions, NGINX routing, JWT strategy, inter-service communication, and Database Strategy embedded as Section 6.</w:t>
-            </w:r>
-          </w:p>
-        </w:tc>
-      </w:tr>
-      <w:tr>
-        <w:tc>
-          <w:tcPr>
-            <w:tcW w:w="4320" w:type="dxa"/>
-          </w:tcPr>
-          <w:p>
-            <w:r>
-              <w:rPr>
-                <w:b/>
-              </w:rPr>
-              <w:t>Prompt used</w:t>
-            </w:r>
-          </w:p>
-        </w:tc>
-        <w:tc>
-          <w:tcPr>
-            <w:tcW w:w="4320" w:type="dxa"/>
-          </w:tcPr>
-          <w:p>
-            <w:r>
-              <w:t>"continue" (following the confirmed delivery plan)</w:t>
-            </w:r>
-          </w:p>
-        </w:tc>
-      </w:tr>
-      <w:tr>
-        <w:tc>
-          <w:tcPr>
-            <w:tcW w:w="4320" w:type="dxa"/>
-          </w:tcPr>
-          <w:p>
-            <w:r>
-              <w:rPr>
-                <w:b/>
-              </w:rPr>
-              <w:t>AI output (summary)</w:t>
-            </w:r>
-          </w:p>
-        </w:tc>
-        <w:tc>
-          <w:tcPr>
-            <w:tcW w:w="4320" w:type="dxa"/>
-          </w:tcPr>
-          <w:p>
-            <w:r>
-              <w:t xml:space="preserve">Generated 11-section document: executive summary, system context, architectural principles, all 8 service descriptions (port, DB, endpoints), technology decisions table (7 rows with rationale), NGINX routing table, JWT strategy, sync REST and async Kafka </w:t>
-            </w:r>
-            <w:r>
-              <w:lastRenderedPageBreak/>
-              <w:t>communication tables, Database Strategy database-per-service discussion (shared DB rejected, MongoDB justified), deployment overview, assumptions and constraints.</w:t>
-            </w:r>
-          </w:p>
-        </w:tc>
-      </w:tr>
-      <w:tr>
-        <w:tc>
-          <w:tcPr>
-            <w:tcW w:w="4320" w:type="dxa"/>
-          </w:tcPr>
-          <w:p>
-            <w:r>
-              <w:rPr>
-                <w:b/>
-              </w:rPr>
-              <w:lastRenderedPageBreak/>
-              <w:t>Human corrections</w:t>
-            </w:r>
-          </w:p>
-        </w:tc>
-        <w:tc>
-          <w:tcPr>
-            <w:tcW w:w="4320" w:type="dxa"/>
-          </w:tcPr>
-          <w:p>
-            <w:r>
-              <w:t>[YOUR INPUT REQUIRED]</w:t>
-            </w:r>
-          </w:p>
-        </w:tc>
-      </w:tr>
-      <w:tr>
-        <w:tc>
-          <w:tcPr>
-            <w:tcW w:w="4320" w:type="dxa"/>
-          </w:tcPr>
-          <w:p>
-            <w:r>
-              <w:rPr>
-                <w:b/>
-              </w:rPr>
-              <w:t>Validation method</w:t>
-            </w:r>
-          </w:p>
-        </w:tc>
-        <w:tc>
-          <w:tcPr>
-            <w:tcW w:w="4320" w:type="dxa"/>
-          </w:tcPr>
-          <w:p>
-            <w:r>
-              <w:t>[YOUR INPUT REQUIRED] — e.g., Cross-referenced all service details against Service Identification Table for consistency; verified DB names match the architecture PNG.</w:t>
-            </w:r>
-          </w:p>
-        </w:tc>
-      </w:tr>
-      <w:tr>
-        <w:tc>
-          <w:tcPr>
-            <w:tcW w:w="4320" w:type="dxa"/>
-          </w:tcPr>
-          <w:p>
-            <w:r>
-              <w:rPr>
-                <w:b/>
-              </w:rPr>
-              <w:t>Mistakes / hallucinations</w:t>
-            </w:r>
-          </w:p>
-        </w:tc>
-        <w:tc>
-          <w:tcPr>
-            <w:tcW w:w="4320" w:type="dxa"/>
-          </w:tcPr>
-          <w:p>
-            <w:r>
-              <w:t>[YOUR INPUT REQUIRED]</w:t>
-            </w:r>
-          </w:p>
-        </w:tc>
-      </w:tr>
-      <w:tr>
-        <w:tc>
-          <w:tcPr>
-            <w:tcW w:w="4320" w:type="dxa"/>
-          </w:tcPr>
-          <w:p>
-            <w:r>
-              <w:rPr>
-                <w:b/>
-              </w:rPr>
-              <w:t>Ethical / privacy concerns</w:t>
-            </w:r>
-          </w:p>
-        </w:tc>
-        <w:tc>
-          <w:tcPr>
-            <w:tcW w:w="4320" w:type="dxa"/>
-          </w:tcPr>
-          <w:p>
-            <w:r>
-              <w:t>No sensitive data.</w:t>
-            </w:r>
-          </w:p>
-        </w:tc>
-      </w:tr>
-      <w:tr>
-        <w:tc>
-          <w:tcPr>
-            <w:tcW w:w="4320" w:type="dxa"/>
-          </w:tcPr>
-          <w:p>
-            <w:r>
-              <w:rPr>
-                <w:b/>
-              </w:rPr>
-              <w:t>Reflection</w:t>
-            </w:r>
-          </w:p>
-        </w:tc>
-        <w:tc>
-          <w:tcPr>
-            <w:tcW w:w="4320" w:type="dxa"/>
-          </w:tcPr>
-          <w:p>
-            <w:r>
-              <w:t>[YOUR INPUT REQUIRED]</w:t>
-            </w:r>
-          </w:p>
-        </w:tc>
-      </w:tr>
-    </w:tbl>
-    <w:p/>
-    <w:p>
-      <w:pPr>
-        <w:pStyle w:val="Heading2"/>
-      </w:pPr>
-      <w:r>
-        <w:t>Entry 8 — Generate Bounded Context Diagram</w:t>
-      </w:r>
-    </w:p>
-    <w:tbl>
-      <w:tblPr>
-        <w:tblStyle w:val="TableGrid"/>
-        <w:tblW w:w="0" w:type="auto"/>
-        <w:tblLook w:val="04A0" w:firstRow="1" w:lastRow="0" w:firstColumn="1" w:lastColumn="0" w:noHBand="0" w:noVBand="1"/>
-      </w:tblPr>
-      <w:tblGrid>
-        <w:gridCol w:w="4320"/>
-        <w:gridCol w:w="4320"/>
-      </w:tblGrid>
-      <w:tr>
-        <w:tc>
-          <w:tcPr>
-            <w:tcW w:w="4320" w:type="dxa"/>
-          </w:tcPr>
-          <w:p>
-            <w:r>
-              <w:rPr>
-                <w:b/>
-              </w:rPr>
-              <w:t>Tool used</w:t>
-            </w:r>
-          </w:p>
-        </w:tc>
-        <w:tc>
-          <w:tcPr>
-            <w:tcW w:w="4320" w:type="dxa"/>
-          </w:tcPr>
-          <w:p>
-            <w:r>
-              <w:t>Claude claude-sonnet-4-6 via Claude Code CLI</w:t>
-            </w:r>
-          </w:p>
-        </w:tc>
-      </w:tr>
-      <w:tr>
-        <w:tc>
-          <w:tcPr>
-            <w:tcW w:w="4320" w:type="dxa"/>
-          </w:tcPr>
-          <w:p>
-            <w:r>
-              <w:rPr>
-                <w:b/>
-              </w:rPr>
-              <w:t>Task / purpose</w:t>
-            </w:r>
-          </w:p>
-        </w:tc>
-        <w:tc>
-          <w:tcPr>
-            <w:tcW w:w="4320" w:type="dxa"/>
-          </w:tcPr>
-          <w:p>
-            <w:r>
-              <w:t>Generate Bounded Context Diagram_Bounded_Context_Diagram.md (Mermaid source) and Bounded Context Diagram_Bounded_Context_Diagram.docx showing each service as a bounded context with owned entities, fields, and cross-boundary references as dashed arrows.</w:t>
-            </w:r>
-          </w:p>
-        </w:tc>
-      </w:tr>
-      <w:tr>
-        <w:tc>
-          <w:tcPr>
-            <w:tcW w:w="4320" w:type="dxa"/>
-          </w:tcPr>
-          <w:p>
-            <w:r>
-              <w:rPr>
-                <w:b/>
-              </w:rPr>
-              <w:t>Prompt used</w:t>
-            </w:r>
-          </w:p>
-        </w:tc>
-        <w:tc>
-          <w:tcPr>
-            <w:tcW w:w="4320" w:type="dxa"/>
-          </w:tcPr>
-          <w:p>
-            <w:r>
-              <w:t>"yes, start" (after confirming to proceed with Bounded Context Diagram)</w:t>
-            </w:r>
-          </w:p>
-        </w:tc>
-      </w:tr>
-      <w:tr>
-        <w:tc>
-          <w:tcPr>
-            <w:tcW w:w="4320" w:type="dxa"/>
-          </w:tcPr>
-          <w:p>
-            <w:r>
-              <w:rPr>
-                <w:b/>
-              </w:rPr>
-              <w:t>AI output (summary)</w:t>
-            </w:r>
-          </w:p>
-        </w:tc>
-        <w:tc>
-          <w:tcPr>
-            <w:tcW w:w="4320" w:type="dxa"/>
-          </w:tcPr>
-          <w:p>
-            <w:r>
-              <w:t>Generated Mermaid flowchart with 8 subgraphs (one per service), each showing entity names and key fields. Dashed arrows for 9 cross-boundary references labelled with mechanism (REST verify / Kafka event / ref). DOCX includes descriptions of all 8 bounded contexts, cross-boundary reference table, and 5 data ownership rules.</w:t>
-            </w:r>
-          </w:p>
-        </w:tc>
-      </w:tr>
-      <w:tr>
-        <w:tc>
-          <w:tcPr>
-            <w:tcW w:w="4320" w:type="dxa"/>
-          </w:tcPr>
-          <w:p>
-            <w:r>
-              <w:rPr>
-                <w:b/>
-              </w:rPr>
-              <w:t>Human corrections</w:t>
-            </w:r>
-          </w:p>
-        </w:tc>
-        <w:tc>
-          <w:tcPr>
-            <w:tcW w:w="4320" w:type="dxa"/>
-          </w:tcPr>
-          <w:p>
-            <w:r>
-              <w:t>[YOUR INPUT REQUIRED] — e.g., Verified entity fields match Mongoose model definitions in the prototype code.</w:t>
-            </w:r>
-          </w:p>
-        </w:tc>
-      </w:tr>
-      <w:tr>
-        <w:tc>
-          <w:tcPr>
-            <w:tcW w:w="4320" w:type="dxa"/>
-          </w:tcPr>
-          <w:p>
-            <w:r>
-              <w:rPr>
-                <w:b/>
-              </w:rPr>
-              <w:t>Validation method</w:t>
-            </w:r>
-          </w:p>
-        </w:tc>
-        <w:tc>
-          <w:tcPr>
-            <w:tcW w:w="4320" w:type="dxa"/>
-          </w:tcPr>
-          <w:p>
-            <w:r>
-              <w:t>[YOUR INPUT REQUIRED] — e.g., Rendered Mermaid in mermaid.live and checked all 8 contexts were visible and correctly linked.</w:t>
-            </w:r>
-          </w:p>
-        </w:tc>
-      </w:tr>
-      <w:tr>
-        <w:tc>
-          <w:tcPr>
-            <w:tcW w:w="4320" w:type="dxa"/>
-          </w:tcPr>
-          <w:p>
-            <w:r>
-              <w:rPr>
-                <w:b/>
-              </w:rPr>
-              <w:t>Mistakes / hallucinations</w:t>
-            </w:r>
-          </w:p>
-        </w:tc>
-        <w:tc>
-          <w:tcPr>
-            <w:tcW w:w="4320" w:type="dxa"/>
-          </w:tcPr>
-          <w:p>
-            <w:r>
-              <w:t>[YOUR INPUT REQUIRED]</w:t>
-            </w:r>
-          </w:p>
-        </w:tc>
-      </w:tr>
-      <w:tr>
-        <w:tc>
-          <w:tcPr>
-            <w:tcW w:w="4320" w:type="dxa"/>
-          </w:tcPr>
-          <w:p>
-            <w:r>
-              <w:rPr>
-                <w:b/>
-              </w:rPr>
-              <w:t>Ethical / privacy concerns</w:t>
-            </w:r>
-          </w:p>
-        </w:tc>
-        <w:tc>
-          <w:tcPr>
-            <w:tcW w:w="4320" w:type="dxa"/>
-          </w:tcPr>
-          <w:p>
-            <w:r>
-              <w:t>No sensitive data.</w:t>
-            </w:r>
-          </w:p>
-        </w:tc>
-      </w:tr>
-      <w:tr>
-        <w:tc>
-          <w:tcPr>
-            <w:tcW w:w="4320" w:type="dxa"/>
-          </w:tcPr>
-          <w:p>
-            <w:r>
-              <w:rPr>
-                <w:b/>
-              </w:rPr>
-              <w:t>Reflection</w:t>
-            </w:r>
-          </w:p>
-        </w:tc>
-        <w:tc>
-          <w:tcPr>
-            <w:tcW w:w="4320" w:type="dxa"/>
-          </w:tcPr>
-          <w:p>
-            <w:r>
-              <w:t>[YOUR INPUT REQUIRED]</w:t>
-            </w:r>
-          </w:p>
-        </w:tc>
-      </w:tr>
-    </w:tbl>
-    <w:p/>
-    <w:p>
-      <w:pPr>
-        <w:pStyle w:val="Heading2"/>
-      </w:pPr>
-      <w:r>
-        <w:t>Entry 9 — Generate API Endpoint Design</w:t>
-      </w:r>
-    </w:p>
-    <w:tbl>
-      <w:tblPr>
-        <w:tblStyle w:val="TableGrid"/>
-        <w:tblW w:w="0" w:type="auto"/>
-        <w:tblLook w:val="04A0" w:firstRow="1" w:lastRow="0" w:firstColumn="1" w:lastColumn="0" w:noHBand="0" w:noVBand="1"/>
-      </w:tblPr>
-      <w:tblGrid>
-        <w:gridCol w:w="4320"/>
-        <w:gridCol w:w="4320"/>
-      </w:tblGrid>
-      <w:tr>
-        <w:tc>
-          <w:tcPr>
-            <w:tcW w:w="4320" w:type="dxa"/>
-          </w:tcPr>
-          <w:p>
-            <w:r>
-              <w:rPr>
-                <w:b/>
-              </w:rPr>
-              <w:t>Tool used</w:t>
-            </w:r>
-          </w:p>
-        </w:tc>
-        <w:tc>
-          <w:tcPr>
-            <w:tcW w:w="4320" w:type="dxa"/>
-          </w:tcPr>
-          <w:p>
-            <w:r>
-              <w:t xml:space="preserve">Claude claude-sonnet-4-6 via Claude Code </w:t>
-            </w:r>
-            <w:r>
-              <w:lastRenderedPageBreak/>
-              <w:t>CLI</w:t>
-            </w:r>
-          </w:p>
-        </w:tc>
-      </w:tr>
-      <w:tr>
-        <w:tc>
-          <w:tcPr>
-            <w:tcW w:w="4320" w:type="dxa"/>
-          </w:tcPr>
-          <w:p>
-            <w:r>
-              <w:rPr>
-                <w:b/>
-              </w:rPr>
-              <w:lastRenderedPageBreak/>
-              <w:t>Task / purpose</w:t>
-            </w:r>
-          </w:p>
-        </w:tc>
-        <w:tc>
-          <w:tcPr>
-            <w:tcW w:w="4320" w:type="dxa"/>
-          </w:tcPr>
-          <w:p>
-            <w:r>
-              <w:t>Generate API Endpoint Design_API_Endpoint_Design.docx with full endpoint specifications for all 8 services: HTTP method, path, auth requirement, request body schema, response schema, status codes, and notes.</w:t>
-            </w:r>
-          </w:p>
-        </w:tc>
-      </w:tr>
-      <w:tr>
-        <w:tc>
-          <w:tcPr>
-            <w:tcW w:w="4320" w:type="dxa"/>
-          </w:tcPr>
-          <w:p>
-            <w:r>
-              <w:rPr>
-                <w:b/>
-              </w:rPr>
-              <w:t>Prompt used</w:t>
-            </w:r>
-          </w:p>
-        </w:tc>
-        <w:tc>
-          <w:tcPr>
-            <w:tcW w:w="4320" w:type="dxa"/>
-          </w:tcPr>
-          <w:p>
-            <w:r>
-              <w:t>"Continue with API Endpoint Design"</w:t>
-            </w:r>
-          </w:p>
-        </w:tc>
-      </w:tr>
-      <w:tr>
-        <w:tc>
-          <w:tcPr>
-            <w:tcW w:w="4320" w:type="dxa"/>
-          </w:tcPr>
-          <w:p>
-            <w:r>
-              <w:rPr>
-                <w:b/>
-              </w:rPr>
-              <w:t>AI output (summary)</w:t>
-            </w:r>
-          </w:p>
-        </w:tc>
-        <w:tc>
-          <w:tcPr>
-            <w:tcW w:w="4320" w:type="dxa"/>
-          </w:tcPr>
-          <w:p>
-            <w:r>
-              <w:t>Generated 10-section document with 29 endpoints across 8 services. Each endpoint has a detail block with JSON request/response schemas and status codes. Highlighted cross-service endpoints (POST /api/exams/:id/entries with 502 on Student Service failure; POST /api/transcripts/:studentId/generate with 502 on Result Service failure). Section 10 is a full summary table of all 29 endpoints.</w:t>
-            </w:r>
-          </w:p>
-        </w:tc>
-      </w:tr>
-      <w:tr>
-        <w:tc>
-          <w:tcPr>
-            <w:tcW w:w="4320" w:type="dxa"/>
-          </w:tcPr>
-          <w:p>
-            <w:r>
-              <w:rPr>
-                <w:b/>
-              </w:rPr>
-              <w:t>Human corrections</w:t>
-            </w:r>
-          </w:p>
-        </w:tc>
-        <w:tc>
-          <w:tcPr>
-            <w:tcW w:w="4320" w:type="dxa"/>
-          </w:tcPr>
-          <w:p>
-            <w:r>
-              <w:t>[YOUR INPUT REQUIRED]</w:t>
-            </w:r>
-          </w:p>
-        </w:tc>
-      </w:tr>
-      <w:tr>
-        <w:tc>
-          <w:tcPr>
-            <w:tcW w:w="4320" w:type="dxa"/>
-          </w:tcPr>
-          <w:p>
-            <w:r>
-              <w:rPr>
-                <w:b/>
-              </w:rPr>
-              <w:t>Validation method</w:t>
-            </w:r>
-          </w:p>
-        </w:tc>
-        <w:tc>
-          <w:tcPr>
-            <w:tcW w:w="4320" w:type="dxa"/>
-          </w:tcPr>
-          <w:p>
-            <w:r>
-              <w:t>[YOUR INPUT REQUIRED] — e.g., Verified implemented endpoints in the prototype match the designed endpoints in API Endpoint Design.</w:t>
-            </w:r>
-          </w:p>
-        </w:tc>
-      </w:tr>
-      <w:tr>
-        <w:tc>
-          <w:tcPr>
-            <w:tcW w:w="4320" w:type="dxa"/>
-          </w:tcPr>
-          <w:p>
-            <w:r>
-              <w:rPr>
-                <w:b/>
-              </w:rPr>
-              <w:t>Mistakes / hallucinations</w:t>
-            </w:r>
-          </w:p>
-        </w:tc>
-        <w:tc>
-          <w:tcPr>
-            <w:tcW w:w="4320" w:type="dxa"/>
-          </w:tcPr>
-          <w:p>
-            <w:r>
-              <w:t>[YOUR INPUT REQUIRED]</w:t>
-            </w:r>
-          </w:p>
-        </w:tc>
-      </w:tr>
-      <w:tr>
-        <w:tc>
-          <w:tcPr>
-            <w:tcW w:w="4320" w:type="dxa"/>
-          </w:tcPr>
-          <w:p>
-            <w:r>
-              <w:rPr>
-                <w:b/>
-              </w:rPr>
-              <w:t>Ethical / privacy concerns</w:t>
-            </w:r>
-          </w:p>
-        </w:tc>
-        <w:tc>
-          <w:tcPr>
-            <w:tcW w:w="4320" w:type="dxa"/>
-          </w:tcPr>
-          <w:p>
-            <w:r>
-              <w:t>No sensitive data.</w:t>
-            </w:r>
-          </w:p>
-        </w:tc>
-      </w:tr>
-      <w:tr>
-        <w:tc>
-          <w:tcPr>
-            <w:tcW w:w="4320" w:type="dxa"/>
-          </w:tcPr>
-          <w:p>
-            <w:r>
-              <w:rPr>
-                <w:b/>
-              </w:rPr>
-              <w:t>Reflection</w:t>
-            </w:r>
-          </w:p>
-        </w:tc>
-        <w:tc>
-          <w:tcPr>
-            <w:tcW w:w="4320" w:type="dxa"/>
-          </w:tcPr>
-          <w:p>
-            <w:r>
-              <w:t>[YOUR INPUT REQUIRED]</w:t>
-            </w:r>
-          </w:p>
-        </w:tc>
-      </w:tr>
-    </w:tbl>
-    <w:p/>
-    <w:p>
-      <w:pPr>
-        <w:pStyle w:val="Heading2"/>
-      </w:pPr>
-      <w:r>
-        <w:t>Entry 10 — Generate Service Communication Diagram</w:t>
-      </w:r>
-    </w:p>
-    <w:tbl>
-      <w:tblPr>
-        <w:tblStyle w:val="TableGrid"/>
-        <w:tblW w:w="0" w:type="auto"/>
-        <w:tblLook w:val="04A0" w:firstRow="1" w:lastRow="0" w:firstColumn="1" w:lastColumn="0" w:noHBand="0" w:noVBand="1"/>
-      </w:tblPr>
-      <w:tblGrid>
-        <w:gridCol w:w="4124"/>
-        <w:gridCol w:w="4732"/>
-      </w:tblGrid>
-      <w:tr>
-        <w:tc>
-          <w:tcPr>
-            <w:tcW w:w="4320" w:type="dxa"/>
-          </w:tcPr>
-          <w:p>
-            <w:r>
-              <w:rPr>
-                <w:b/>
-              </w:rPr>
-              <w:t>Tool used</w:t>
-            </w:r>
-          </w:p>
-        </w:tc>
-        <w:tc>
-          <w:tcPr>
-            <w:tcW w:w="4320" w:type="dxa"/>
-          </w:tcPr>
-          <w:p>
-            <w:r>
-              <w:t>Claude claude-sonnet-4-6 via Claude Code CLI</w:t>
-            </w:r>
-          </w:p>
-        </w:tc>
-      </w:tr>
-      <w:tr>
-        <w:tc>
-          <w:tcPr>
-            <w:tcW w:w="4320" w:type="dxa"/>
-          </w:tcPr>
-          <w:p>
-            <w:r>
-              <w:rPr>
-                <w:b/>
-              </w:rPr>
-              <w:t>Task / purpose</w:t>
-            </w:r>
-          </w:p>
-        </w:tc>
-        <w:tc>
-          <w:tcPr>
-            <w:tcW w:w="4320" w:type="dxa"/>
-          </w:tcPr>
-          <w:p>
-            <w:r>
-              <w:t>Generate Service Communication Diagram_Service_Communication_Diagram.md (Mermaid source) and Service Communication Diagram_Service_Communication_Diagram.docx showing all service communication: NGINX routing, cross-service sync REST calls, and async Kafka events.</w:t>
-            </w:r>
-          </w:p>
-        </w:tc>
-      </w:tr>
-      <w:tr>
-        <w:tc>
-          <w:tcPr>
-            <w:tcW w:w="4320" w:type="dxa"/>
-          </w:tcPr>
-          <w:p>
-            <w:r>
-              <w:rPr>
-                <w:b/>
-              </w:rPr>
-              <w:t>Prompt used</w:t>
-            </w:r>
-          </w:p>
-        </w:tc>
-        <w:tc>
-          <w:tcPr>
-            <w:tcW w:w="4320" w:type="dxa"/>
-          </w:tcPr>
-          <w:p>
-            <w:r>
-              <w:t>"Continue with Service Communication Diagram"</w:t>
-            </w:r>
-          </w:p>
-        </w:tc>
-      </w:tr>
-      <w:tr>
-        <w:tc>
-          <w:tcPr>
-            <w:tcW w:w="4320" w:type="dxa"/>
-          </w:tcPr>
-          <w:p>
-            <w:r>
-              <w:rPr>
-                <w:b/>
-              </w:rPr>
-              <w:t>AI output (summary)</w:t>
-            </w:r>
-          </w:p>
-        </w:tc>
-        <w:tc>
-          <w:tcPr>
-            <w:tcW w:w="4320" w:type="dxa"/>
-          </w:tcPr>
-          <w:p>
-            <w:r>
-              <w:t>Generated Mermaid flowchart with 4 subgraphs (Client, Services, Kafka, MongoDB). Solid arrows for NGINX → service routing (8 paths) and cross-service REST calls (Exam→Student, Transcript→Result). Dashed arrows for Kafka: 3 producers and 5 consumer subscriptions. DOCX has 8 sections covering communication layers, sync flows table, 3 Kafka event detail blocks, NGINX routing table, error propagation rules, and prototype scope note.</w:t>
-            </w:r>
-          </w:p>
-        </w:tc>
-      </w:tr>
-      <w:tr>
-        <w:tc>
-          <w:tcPr>
-            <w:tcW w:w="4320" w:type="dxa"/>
-          </w:tcPr>
-          <w:p>
-            <w:r>
-              <w:rPr>
-                <w:b/>
-              </w:rPr>
-              <w:lastRenderedPageBreak/>
-              <w:t>Human corrections</w:t>
-            </w:r>
-          </w:p>
-        </w:tc>
-        <w:tc>
-          <w:tcPr>
-            <w:tcW w:w="4320" w:type="dxa"/>
-          </w:tcPr>
-          <w:p>
-            <w:r>
-              <w:t>[YOUR INPUT REQUIRED]</w:t>
-            </w:r>
-          </w:p>
-        </w:tc>
-      </w:tr>
-      <w:tr>
-        <w:tc>
-          <w:tcPr>
-            <w:tcW w:w="4320" w:type="dxa"/>
-          </w:tcPr>
-          <w:p>
-            <w:r>
-              <w:rPr>
-                <w:b/>
-              </w:rPr>
-              <w:t>Validation method</w:t>
-            </w:r>
-          </w:p>
-        </w:tc>
-        <w:tc>
-          <w:tcPr>
-            <w:tcW w:w="4320" w:type="dxa"/>
-          </w:tcPr>
-          <w:p>
-            <w:r>
-              <w:t>[YOUR INPUT REQUIRED] — e.g., Rendered diagram in mermaid.live and verified all arrows match API Endpoint Design API designs and Bounded Context Diagram cross-boundary references.</w:t>
-            </w:r>
-          </w:p>
-        </w:tc>
-      </w:tr>
-      <w:tr>
-        <w:tc>
-          <w:tcPr>
-            <w:tcW w:w="4320" w:type="dxa"/>
-          </w:tcPr>
-          <w:p>
-            <w:r>
-              <w:rPr>
-                <w:b/>
-              </w:rPr>
-              <w:t>Mistakes / hallucinations</w:t>
-            </w:r>
-          </w:p>
-        </w:tc>
-        <w:tc>
-          <w:tcPr>
-            <w:tcW w:w="4320" w:type="dxa"/>
-          </w:tcPr>
-          <w:p>
-            <w:r>
-              <w:t>[YOUR INPUT REQUIRED]</w:t>
-            </w:r>
-          </w:p>
-        </w:tc>
-      </w:tr>
-      <w:tr>
-        <w:tc>
-          <w:tcPr>
-            <w:tcW w:w="4320" w:type="dxa"/>
-          </w:tcPr>
-          <w:p>
-            <w:r>
-              <w:rPr>
-                <w:b/>
-              </w:rPr>
-              <w:t>Ethical / privacy concerns</w:t>
-            </w:r>
-          </w:p>
-        </w:tc>
-        <w:tc>
-          <w:tcPr>
-            <w:tcW w:w="4320" w:type="dxa"/>
-          </w:tcPr>
-          <w:p>
-            <w:r>
-              <w:t>No sensitive data.</w:t>
-            </w:r>
-          </w:p>
-        </w:tc>
-      </w:tr>
-      <w:tr>
-        <w:tc>
-          <w:tcPr>
-            <w:tcW w:w="4320" w:type="dxa"/>
-          </w:tcPr>
-          <w:p>
-            <w:r>
-              <w:rPr>
-                <w:b/>
-              </w:rPr>
-              <w:t>Reflection</w:t>
-            </w:r>
-          </w:p>
-        </w:tc>
-        <w:tc>
-          <w:tcPr>
-            <w:tcW w:w="4320" w:type="dxa"/>
-          </w:tcPr>
-          <w:p>
-            <w:r>
-              <w:t>[YOUR INPUT REQUIRED]</w:t>
-            </w:r>
-          </w:p>
-        </w:tc>
-      </w:tr>
-    </w:tbl>
-    <w:p/>
-    <w:p>
-      <w:pPr>
-        <w:pStyle w:val="Heading1"/>
-      </w:pPr>
-      <w:r>
-        <w:t>4. Blank Template for Additional Entries</w:t>
-      </w:r>
-    </w:p>
-    <w:p>
-      <w:r>
-        <w:t>Use the template below for any additional AI interactions not captured above (e.g., further prompt iterations, diagram revisions, debugging help).</w:t>
-      </w:r>
-    </w:p>
-    <w:tbl>
-      <w:tblPr>
-        <w:tblStyle w:val="TableGrid"/>
-        <w:tblW w:w="0" w:type="auto"/>
-        <w:tblLook w:val="04A0" w:firstRow="1" w:lastRow="0" w:firstColumn="1" w:lastColumn="0" w:noHBand="0" w:noVBand="1"/>
-      </w:tblPr>
-      <w:tblGrid>
-        <w:gridCol w:w="4320"/>
-        <w:gridCol w:w="4320"/>
-      </w:tblGrid>
-      <w:tr>
-        <w:tc>
-          <w:tcPr>
-            <w:tcW w:w="4320" w:type="dxa"/>
-          </w:tcPr>
-          <w:p>
-            <w:r>
-              <w:rPr>
-                <w:b/>
-              </w:rPr>
-              <w:t>Tool used</w:t>
-            </w:r>
-          </w:p>
-        </w:tc>
-        <w:tc>
-          <w:tcPr>
-            <w:tcW w:w="4320" w:type="dxa"/>
-          </w:tcPr>
-          <w:p/>
-        </w:tc>
-      </w:tr>
-      <w:tr>
-        <w:tc>
-          <w:tcPr>
-            <w:tcW w:w="4320" w:type="dxa"/>
-          </w:tcPr>
-          <w:p>
-            <w:r>
-              <w:rPr>
-                <w:b/>
-              </w:rPr>
-              <w:t>Task / purpose</w:t>
-            </w:r>
-          </w:p>
-        </w:tc>
-        <w:tc>
-          <w:tcPr>
-            <w:tcW w:w="4320" w:type="dxa"/>
-          </w:tcPr>
-          <w:p/>
-        </w:tc>
-      </w:tr>
-      <w:tr>
-        <w:tc>
-          <w:tcPr>
-            <w:tcW w:w="4320" w:type="dxa"/>
-          </w:tcPr>
-          <w:p>
-            <w:r>
-              <w:rPr>
-                <w:b/>
-              </w:rPr>
-              <w:t>Prompt used</w:t>
-            </w:r>
-          </w:p>
-        </w:tc>
-        <w:tc>
-          <w:tcPr>
-            <w:tcW w:w="4320" w:type="dxa"/>
-          </w:tcPr>
-          <w:p/>
-        </w:tc>
-      </w:tr>
-      <w:tr>
-        <w:tc>
-          <w:tcPr>
-            <w:tcW w:w="4320" w:type="dxa"/>
-          </w:tcPr>
-          <w:p>
-            <w:r>
-              <w:rPr>
-                <w:b/>
-              </w:rPr>
-              <w:t>AI output (summary)</w:t>
-            </w:r>
-          </w:p>
-        </w:tc>
-        <w:tc>
-          <w:tcPr>
-            <w:tcW w:w="4320" w:type="dxa"/>
-          </w:tcPr>
-          <w:p/>
-        </w:tc>
-      </w:tr>
-      <w:tr>
-        <w:tc>
-          <w:tcPr>
-            <w:tcW w:w="4320" w:type="dxa"/>
-          </w:tcPr>
-          <w:p>
-            <w:r>
-              <w:rPr>
-                <w:b/>
-              </w:rPr>
-              <w:t>Human corrections</w:t>
-            </w:r>
-          </w:p>
-        </w:tc>
-        <w:tc>
-          <w:tcPr>
-            <w:tcW w:w="4320" w:type="dxa"/>
-          </w:tcPr>
-          <w:p/>
-        </w:tc>
-      </w:tr>
-      <w:tr>
-        <w:tc>
-          <w:tcPr>
-            <w:tcW w:w="4320" w:type="dxa"/>
-          </w:tcPr>
-          <w:p>
-            <w:r>
-              <w:rPr>
-                <w:b/>
-              </w:rPr>
-              <w:t>Validation method</w:t>
-            </w:r>
-          </w:p>
-        </w:tc>
-        <w:tc>
-          <w:tcPr>
-            <w:tcW w:w="4320" w:type="dxa"/>
-          </w:tcPr>
-          <w:p/>
-        </w:tc>
-      </w:tr>
-      <w:tr>
-        <w:tc>
-          <w:tcPr>
-            <w:tcW w:w="4320" w:type="dxa"/>
-          </w:tcPr>
-          <w:p>
-            <w:r>
-              <w:rPr>
-                <w:b/>
-              </w:rPr>
-              <w:t>Mistakes / hallucinations</w:t>
-            </w:r>
-          </w:p>
-        </w:tc>
-        <w:tc>
-          <w:tcPr>
-            <w:tcW w:w="4320" w:type="dxa"/>
-          </w:tcPr>
-          <w:p/>
-        </w:tc>
-      </w:tr>
-      <w:tr>
-        <w:tc>
-          <w:tcPr>
-            <w:tcW w:w="4320" w:type="dxa"/>
-          </w:tcPr>
-          <w:p>
-            <w:r>
-              <w:rPr>
-                <w:b/>
-              </w:rPr>
-              <w:t>Ethical / privacy concerns</w:t>
-            </w:r>
-          </w:p>
-        </w:tc>
-        <w:tc>
-          <w:tcPr>
-            <w:tcW w:w="4320" w:type="dxa"/>
-          </w:tcPr>
-          <w:p/>
-        </w:tc>
-      </w:tr>
-      <w:tr>
-        <w:tc>
-          <w:tcPr>
-            <w:tcW w:w="4320" w:type="dxa"/>
-          </w:tcPr>
-          <w:p>
-            <w:r>
-              <w:rPr>
-                <w:b/>
-              </w:rPr>
-              <w:t>Reflection</w:t>
-            </w:r>
-          </w:p>
-        </w:tc>
-        <w:tc>
-          <w:tcPr>
-            <w:tcW w:w="4320" w:type="dxa"/>
-          </w:tcPr>
-          <w:p/>
-        </w:tc>
-      </w:tr>
-    </w:tbl>
-    <w:p/>
-    <w:p>
-      <w:pPr>
-        <w:pStyle w:val="Heading1"/>
-      </w:pPr>
-      <w:r>
-        <w:t>5. Overall Reflection</w:t>
-      </w:r>
-    </w:p>
-    <w:p>
-      <w:r>
-        <w:t>[YOUR INPUT REQUIRED] — Write 1–2 paragraphs reflecting on your overall experience using AI tools in this project. Consider the following questions:</w:t>
-      </w:r>
-    </w:p>
-    <w:p>
-      <w:pPr>
-        <w:pStyle w:val="ListBullet"/>
-      </w:pPr>
-      <w:r>
-        <w:t>Did AI speed up your work, and in which areas was it most useful?</w:t>
-      </w:r>
-    </w:p>
-    <w:p>
-      <w:pPr>
-        <w:pStyle w:val="ListBullet"/>
-      </w:pPr>
-      <w:r>
-        <w:t>Were the AI outputs trustworthy without human review, or did they require significant correction?</w:t>
-      </w:r>
-    </w:p>
-    <w:p>
-      <w:pPr>
-        <w:pStyle w:val="ListBullet"/>
-      </w:pPr>
-      <w:r>
-        <w:t>What would have been different if you had not used AI assistance?</w:t>
-      </w:r>
-    </w:p>
-    <w:p>
-      <w:pPr>
-        <w:pStyle w:val="ListBullet"/>
-      </w:pPr>
-      <w:r>
-        <w:t>What are the risks of relying on AI for software architecture and documentation tasks?</w:t>
-      </w:r>
-    </w:p>
-    <w:p>
-      <w:pPr>
-        <w:pStyle w:val="ListBullet"/>
-      </w:pPr>
-      <w:r>
-        <w:t>What did you learn from validating and correcting AI outputs?</w:t>
-      </w:r>
-    </w:p>
-    <w:p/>
-    <w:p>
-      <w:r>
-        <w:rPr>
-          <w:i/>
-        </w:rPr>
-        <w:t>Note: The AI Usage Report is evaluated on honesty and depth — not on how much AI you used. Admitting hallucinations and corrections demonstrates critical thinking and will score well. Do not leave [YOUR INPUT REQUIRED] placeholders in the final submission.</w:t>
-      </w:r>
-    </w:p>
     <w:sectPr>
       <w:pgSz w:w="12240" w:h="15840"/>
       <w:pgMar w:top="1440" w:right="1800" w:bottom="1440" w:left="1800" w:header="720" w:footer="720" w:gutter="0"/>

</xml_diff>